<commit_message>
B03 d) Marshall-kereszt frissitve/javitva
</commit_message>
<xml_diff>
--- a/study_pack/Zaróvizsga2026_B_tetelek_flashcards.docx
+++ b/study_pack/Zaróvizsga2026_B_tetelek_flashcards.docx
@@ -86,29 +86,7 @@
                 <w:sz w:val="28"/>
                 <w:szCs w:val="28"/>
               </w:rPr>
-              <w:t xml:space="preserve">Az üzleti </w:t>
-            </w:r>
-            <w:proofErr w:type="gramStart"/>
-            <w:r>
-              <w:rPr>
-                <w:rFonts w:ascii="Aptos" w:eastAsia="Aptos" w:hAnsi="Aptos"/>
-                <w:bCs/>
-                <w:color w:val="7030A0"/>
-                <w:sz w:val="28"/>
-                <w:szCs w:val="28"/>
-              </w:rPr>
-              <w:t>vállalat</w:t>
-            </w:r>
-            <w:proofErr w:type="gramEnd"/>
-            <w:r>
-              <w:rPr>
-                <w:rFonts w:ascii="Aptos" w:eastAsia="Aptos" w:hAnsi="Aptos"/>
-                <w:bCs/>
-                <w:color w:val="7030A0"/>
-                <w:sz w:val="28"/>
-                <w:szCs w:val="28"/>
-              </w:rPr>
-              <w:t xml:space="preserve"> mint speciális szervezet</w:t>
+              <w:t>Az üzleti vállalat mint speciális szervezet</w:t>
             </w:r>
           </w:p>
           <w:p>
@@ -1594,27 +1572,7 @@
                 <w:sz w:val="15"/>
                 <w:szCs w:val="15"/>
               </w:rPr>
-              <w:t xml:space="preserve">Az üzleti </w:t>
-            </w:r>
-            <w:proofErr w:type="gramStart"/>
-            <w:r>
-              <w:rPr>
-                <w:rFonts w:ascii="Aptos" w:eastAsia="Aptos" w:hAnsi="Aptos"/>
-                <w:color w:val="000000"/>
-                <w:sz w:val="15"/>
-                <w:szCs w:val="15"/>
-              </w:rPr>
-              <w:t>vállalat</w:t>
-            </w:r>
-            <w:proofErr w:type="gramEnd"/>
-            <w:r>
-              <w:rPr>
-                <w:rFonts w:ascii="Aptos" w:eastAsia="Aptos" w:hAnsi="Aptos"/>
-                <w:color w:val="000000"/>
-                <w:sz w:val="15"/>
-                <w:szCs w:val="15"/>
-              </w:rPr>
-              <w:t xml:space="preserve"> mint speciális szervezet: üzleti vállalkozás = fogyasztói igény + nyereség; vállalat = az üzleti vállalkozás szervezeti/jogi kerete; feltételek: önállóság, saját üzleti fenntartás, kockázatvállalás, valós piac; alapvető cél: fogyasztói igények kielégítése nyereség mellett; kettős értékteremtés: fogyasztói érték + tulajdonosi érték</w:t>
+              <w:t>Az üzleti vállalat mint speciális szervezet: üzleti vállalkozás = fogyasztói igény + nyereség; vállalat = az üzleti vállalkozás szervezeti/jogi kerete; feltételek: önállóság, saját üzleti fenntartás, kockázatvállalás, valós piac; alapvető cél: fogyasztói igények kielégítése nyereség mellett; kettős értékteremtés: fogyasztói érték + tulajdonosi érték</w:t>
             </w:r>
           </w:p>
           <w:p>
@@ -1855,27 +1813,7 @@
                 <w:sz w:val="15"/>
                 <w:szCs w:val="15"/>
               </w:rPr>
-              <w:t xml:space="preserve">A standard mikroökonómiai vállalatfelfogás lényege: racionális döntéshozó; teljes vagy jól kezelhető információ feltételezése; profitmaximalizálás; árak közvetítik az információt; </w:t>
-            </w:r>
-            <w:proofErr w:type="gramStart"/>
-            <w:r>
-              <w:rPr>
-                <w:rFonts w:ascii="Aptos" w:eastAsia="Aptos" w:hAnsi="Aptos"/>
-                <w:color w:val="000000"/>
-                <w:sz w:val="15"/>
-                <w:szCs w:val="15"/>
-              </w:rPr>
-              <w:t>vállalat</w:t>
-            </w:r>
-            <w:proofErr w:type="gramEnd"/>
-            <w:r>
-              <w:rPr>
-                <w:rFonts w:ascii="Aptos" w:eastAsia="Aptos" w:hAnsi="Aptos"/>
-                <w:color w:val="000000"/>
-                <w:sz w:val="15"/>
-                <w:szCs w:val="15"/>
-              </w:rPr>
-              <w:t xml:space="preserve"> mint „fekete doboz”</w:t>
+              <w:t>A standard mikroökonómiai vállalatfelfogás lényege: racionális döntéshozó; teljes vagy jól kezelhető információ feltételezése; profitmaximalizálás; árak közvetítik az információt; vállalat mint „fekete doboz”</w:t>
             </w:r>
           </w:p>
           <w:p>
@@ -2074,7 +2012,36 @@
                 <w:sz w:val="15"/>
                 <w:szCs w:val="15"/>
               </w:rPr>
-              <w:t>A Marshall-kereszt működése: keresleti görbe: ár nő → keresett mennyiség általában csökken; kínálati görbe: ár nő → kínált mennyiség általában nő; metszéspont: egyensúlyi ár és mennyiség; túlkereslet: ár alatt; túlkínálat: ár felett; vállalati jelentőség: árjelzések orientálják a döntéseket</w:t>
+              <w:t xml:space="preserve">A Marshall-kereszt működése: keresleti görbe: </w:t>
+            </w:r>
+            <w:r>
+              <w:rPr>
+                <w:rFonts w:ascii="Aptos" w:eastAsia="Aptos" w:hAnsi="Aptos"/>
+                <w:color w:val="000000"/>
+                <w:sz w:val="15"/>
+                <w:szCs w:val="15"/>
+              </w:rPr>
+              <w:t xml:space="preserve">keresleti görbe: ár nő → keresett mennyiség általában csökken; kínálati görbe: ár nő → kínált mennyiség általában nő; metszéspont: egyensúlyi ár és mennyiség; ár alatt túlkereslet, ár felett túlkínálat; vállalati jelentőség: ár–mennyiség adatok és riportok alapján támogatja az </w:t>
+            </w:r>
+            <w:proofErr w:type="spellStart"/>
+            <w:r>
+              <w:rPr>
+                <w:rFonts w:ascii="Aptos" w:eastAsia="Aptos" w:hAnsi="Aptos"/>
+                <w:color w:val="000000"/>
+                <w:sz w:val="15"/>
+                <w:szCs w:val="15"/>
+              </w:rPr>
+              <w:t>árképzési</w:t>
+            </w:r>
+            <w:proofErr w:type="spellEnd"/>
+            <w:r>
+              <w:rPr>
+                <w:rFonts w:ascii="Aptos" w:eastAsia="Aptos" w:hAnsi="Aptos"/>
+                <w:color w:val="000000"/>
+                <w:sz w:val="15"/>
+                <w:szCs w:val="15"/>
+              </w:rPr>
+              <w:t xml:space="preserve"> és kínálati döntéseket.</w:t>
             </w:r>
           </w:p>
         </w:tc>
@@ -5888,7 +5855,6 @@
   <w:style w:type="character" w:default="1" w:styleId="DefaultParagraphFont">
     <w:name w:val="Default Paragraph Font"/>
     <w:uiPriority w:val="1"/>
-    <w:semiHidden/>
     <w:unhideWhenUsed/>
   </w:style>
   <w:style w:type="table" w:default="1" w:styleId="TableNormal">

</xml_diff>